<commit_message>
Fix vibe links and split homepage
</commit_message>
<xml_diff>
--- a/MBRU/Bloopers_IncidentReports/MBRU Incident Report & Flow Prompts.docx
+++ b/MBRU/Bloopers_IncidentReports/MBRU Incident Report & Flow Prompts.docx
@@ -15,13 +15,13 @@
         <w:shd w:fill="auto" w:val="clear"/>
         <w:spacing w:after="120" w:before="0" w:line="275.9999942779541" w:lineRule="auto"/>
         <w:rPr>
-          <w:rFonts w:ascii="Arial" w:cs="Arial" w:eastAsia="Arial" w:hAnsi="Arial"/>
-          <w:color w:val="1f1f1f"/>
-        </w:rPr>
-      </w:pPr>
-      <w:r>
-        <w:rPr>
-          <w:rFonts w:ascii="Arial" w:cs="Arial" w:eastAsia="Arial" w:hAnsi="Arial"/>
+          <w:rFonts w:ascii="Google Sans" w:cs="Google Sans" w:eastAsia="Google Sans" w:hAnsi="Google Sans"/>
+          <w:color w:val="1f1f1f"/>
+        </w:rPr>
+      </w:pPr>
+      <w:r>
+        <w:rPr>
+          <w:rFonts w:ascii="Google Sans" w:cs="Google Sans" w:eastAsia="Google Sans" w:hAnsi="Google Sans"/>
           <w:color w:val="1f1f1f"/>
           <w:rtl w:val="0"/>
         </w:rPr>
@@ -40,13 +40,13 @@
         <w:shd w:fill="auto" w:val="clear"/>
         <w:spacing w:after="240" w:line="275.9999942779541" w:lineRule="auto"/>
         <w:rPr>
-          <w:rFonts w:ascii="Arial" w:cs="Arial" w:eastAsia="Arial" w:hAnsi="Arial"/>
-          <w:color w:val="1f1f1f"/>
-        </w:rPr>
-      </w:pPr>
-      <w:r>
-        <w:rPr>
-          <w:rFonts w:ascii="Arial" w:cs="Arial" w:eastAsia="Arial" w:hAnsi="Arial"/>
+          <w:rFonts w:ascii="Google Sans" w:cs="Google Sans" w:eastAsia="Google Sans" w:hAnsi="Google Sans"/>
+          <w:color w:val="1f1f1f"/>
+        </w:rPr>
+      </w:pPr>
+      <w:r>
+        <w:rPr>
+          <w:rFonts w:ascii="Google Sans" w:cs="Google Sans" w:eastAsia="Google Sans" w:hAnsi="Google Sans"/>
           <w:b w:val="1"/>
           <w:bCs w:val="1"/>
           <w:color w:val="1f1f1f"/>
@@ -56,7 +56,7 @@
       </w:r>
       <w:r>
         <w:rPr>
-          <w:rFonts w:ascii="Arial" w:cs="Arial" w:eastAsia="Arial" w:hAnsi="Arial"/>
+          <w:rFonts w:ascii="Google Sans" w:cs="Google Sans" w:eastAsia="Google Sans" w:hAnsi="Google Sans"/>
           <w:color w:val="1f1f1f"/>
           <w:rtl w:val="0"/>
         </w:rPr>
@@ -75,13 +75,13 @@
         <w:shd w:fill="auto" w:val="clear"/>
         <w:spacing w:after="240" w:line="275.9999942779541" w:lineRule="auto"/>
         <w:rPr>
-          <w:rFonts w:ascii="Arial" w:cs="Arial" w:eastAsia="Arial" w:hAnsi="Arial"/>
-          <w:color w:val="1f1f1f"/>
-        </w:rPr>
-      </w:pPr>
-      <w:r>
-        <w:rPr>
-          <w:rFonts w:ascii="Arial" w:cs="Arial" w:eastAsia="Arial" w:hAnsi="Arial"/>
+          <w:rFonts w:ascii="Google Sans" w:cs="Google Sans" w:eastAsia="Google Sans" w:hAnsi="Google Sans"/>
+          <w:color w:val="1f1f1f"/>
+        </w:rPr>
+      </w:pPr>
+      <w:r>
+        <w:rPr>
+          <w:rFonts w:ascii="Google Sans" w:cs="Google Sans" w:eastAsia="Google Sans" w:hAnsi="Google Sans"/>
           <w:b w:val="1"/>
           <w:bCs w:val="1"/>
           <w:color w:val="1f1f1f"/>
@@ -91,37 +91,11 @@
       </w:r>
       <w:r>
         <w:rPr>
-          <w:rFonts w:ascii="Arial" w:cs="Arial" w:eastAsia="Arial" w:hAnsi="Arial"/>
-          <w:color w:val="1f1f1f"/>
-          <w:rtl w:val="0"/>
-        </w:rPr>
-        <w:t xml:space="preserve"> Unresolved / Machine Jammed by Ego</w:t>
-      </w:r>
-    </w:p>
-    <w:p>
-      <w:pPr>
-        <w:pStyle w:val="Heading2"/>
-        <w:pBdr>
-          <w:top w:space="0" w:sz="0" w:val="nil"/>
-          <w:left w:space="0" w:sz="0" w:val="nil"/>
-          <w:bottom w:space="0" w:sz="0" w:val="nil"/>
-          <w:right w:space="0" w:sz="0" w:val="nil"/>
-          <w:between w:space="0" w:sz="0" w:val="nil"/>
-        </w:pBdr>
-        <w:shd w:fill="auto" w:val="clear"/>
-        <w:spacing w:after="120" w:before="0" w:line="275.9999942779541" w:lineRule="auto"/>
-        <w:rPr>
-          <w:rFonts w:ascii="Arial" w:cs="Arial" w:eastAsia="Arial" w:hAnsi="Arial"/>
-          <w:color w:val="1f1f1f"/>
-        </w:rPr>
-      </w:pPr>
-      <w:r>
-        <w:rPr>
-          <w:rFonts w:ascii="Arial" w:cs="Arial" w:eastAsia="Arial" w:hAnsi="Arial"/>
-          <w:color w:val="1f1f1f"/>
-          <w:rtl w:val="0"/>
-        </w:rPr>
-        <w:t xml:space="preserve">📁 INCIDENT SUMMARY</w:t>
+          <w:rFonts w:ascii="Google Sans" w:cs="Google Sans" w:eastAsia="Google Sans" w:hAnsi="Google Sans"/>
+          <w:color w:val="1f1f1f"/>
+          <w:rtl w:val="0"/>
+        </w:rPr>
+        <w:t xml:space="preserve"> UNRESOLVED / Auntie Veo has declared a "Wrap"</w:t>
       </w:r>
     </w:p>
     <w:p>
@@ -136,35 +110,53 @@
         <w:shd w:fill="auto" w:val="clear"/>
         <w:spacing w:after="240" w:line="275.9999942779541" w:lineRule="auto"/>
         <w:rPr>
-          <w:rFonts w:ascii="Arial" w:cs="Arial" w:eastAsia="Arial" w:hAnsi="Arial"/>
-          <w:color w:val="1f1f1f"/>
-        </w:rPr>
-      </w:pPr>
-      <w:r>
-        <w:rPr>
-          <w:rFonts w:ascii="Arial" w:cs="Arial" w:eastAsia="Arial" w:hAnsi="Arial"/>
-          <w:color w:val="1f1f1f"/>
-          <w:rtl w:val="0"/>
-        </w:rPr>
-        <w:t xml:space="preserve">Following Monroe Reign’s legitimate victory on the </w:t>
-      </w:r>
-      <w:r>
-        <w:rPr>
-          <w:rFonts w:ascii="Arial" w:cs="Arial" w:eastAsia="Arial" w:hAnsi="Arial"/>
+          <w:rFonts w:ascii="Google Sans" w:cs="Google Sans" w:eastAsia="Google Sans" w:hAnsi="Google Sans"/>
+          <w:color w:val="1f1f1f"/>
+        </w:rPr>
+      </w:pPr>
+      <w:r>
+        <w:rPr>
+          <w:rFonts w:ascii="Google Sans" w:cs="Google Sans" w:eastAsia="Google Sans" w:hAnsi="Google Sans"/>
           <w:b w:val="1"/>
           <w:bCs w:val="1"/>
           <w:color w:val="1f1f1f"/>
           <w:rtl w:val="0"/>
         </w:rPr>
-        <w:t xml:space="preserve">Pettiest</w:t>
-      </w:r>
-      <w:r>
-        <w:rPr>
-          <w:rFonts w:ascii="Arial" w:cs="Arial" w:eastAsia="Arial" w:hAnsi="Arial"/>
-          <w:color w:val="1f1f1f"/>
-          <w:rtl w:val="0"/>
-        </w:rPr>
-        <w:t xml:space="preserve"> tier of the podium, Cain Saint attempted to "normalize the medal distribution" by hacking the high-fashion Red Flag Vending Machine. Cain claimed he was "unlocking the VIP tier," but J.T.’s clipboard notes indicate he was simply trying to find a medal that matched his silk scarf.</w:t>
+        <w:t xml:space="preserve">Verified Footage:</w:t>
+      </w:r>
+      <w:r>
+        <w:rPr>
+          <w:rFonts w:ascii="Google Sans" w:cs="Google Sans" w:eastAsia="Google Sans" w:hAnsi="Google Sans"/>
+          <w:color w:val="1f1f1f"/>
+          <w:rtl w:val="0"/>
+        </w:rPr>
+        <w:t xml:space="preserve"> Clips BV-043-A through N (The Control Room Standoff)</w:t>
+      </w:r>
+    </w:p>
+    <w:p>
+      <w:pPr>
+        <w:pStyle w:val="Heading2"/>
+        <w:pBdr>
+          <w:top w:space="0" w:sz="0" w:val="nil"/>
+          <w:left w:space="0" w:sz="0" w:val="nil"/>
+          <w:bottom w:space="0" w:sz="0" w:val="nil"/>
+          <w:right w:space="0" w:sz="0" w:val="nil"/>
+          <w:between w:space="0" w:sz="0" w:val="nil"/>
+        </w:pBdr>
+        <w:shd w:fill="auto" w:val="clear"/>
+        <w:spacing w:after="120" w:before="0" w:line="275.9999942779541" w:lineRule="auto"/>
+        <w:rPr>
+          <w:rFonts w:ascii="Google Sans" w:cs="Google Sans" w:eastAsia="Google Sans" w:hAnsi="Google Sans"/>
+          <w:color w:val="1f1f1f"/>
+        </w:rPr>
+      </w:pPr>
+      <w:r>
+        <w:rPr>
+          <w:rFonts w:ascii="Google Sans" w:cs="Google Sans" w:eastAsia="Google Sans" w:hAnsi="Google Sans"/>
+          <w:color w:val="1f1f1f"/>
+          <w:rtl w:val="0"/>
+        </w:rPr>
+        <w:t xml:space="preserve">📁 INCIDENT SUMMARY</w:t>
       </w:r>
     </w:p>
     <w:p>
@@ -179,61 +171,53 @@
         <w:shd w:fill="auto" w:val="clear"/>
         <w:spacing w:after="240" w:line="275.9999942779541" w:lineRule="auto"/>
         <w:rPr>
-          <w:rFonts w:ascii="Arial" w:cs="Arial" w:eastAsia="Arial" w:hAnsi="Arial"/>
-          <w:color w:val="1f1f1f"/>
-        </w:rPr>
-      </w:pPr>
-      <w:r>
-        <w:rPr>
-          <w:rFonts w:ascii="Arial" w:cs="Arial" w:eastAsia="Arial" w:hAnsi="Arial"/>
-          <w:color w:val="1f1f1f"/>
-          <w:rtl w:val="0"/>
-        </w:rPr>
-        <w:t xml:space="preserve">The machine, programmed for high-fashion transactions only, did not recognize Cain’s attempt to pay with a "smoldering look." When Cain proceeded to physically kick the machine, it entered a state of </w:t>
-      </w:r>
-      <w:r>
-        <w:rPr>
-          <w:rFonts w:ascii="Arial" w:cs="Arial" w:eastAsia="Arial" w:hAnsi="Arial"/>
+          <w:rFonts w:ascii="Google Sans" w:cs="Google Sans" w:eastAsia="Google Sans" w:hAnsi="Google Sans"/>
+          <w:color w:val="1f1f1f"/>
+        </w:rPr>
+      </w:pPr>
+      <w:r>
+        <w:rPr>
+          <w:rFonts w:ascii="Google Sans" w:cs="Google Sans" w:eastAsia="Google Sans" w:hAnsi="Google Sans"/>
+          <w:color w:val="1f1f1f"/>
+          <w:rtl w:val="0"/>
+        </w:rPr>
+        <w:t xml:space="preserve">Following Monroe Reign’s legitimate victory on the </w:t>
+      </w:r>
+      <w:r>
+        <w:rPr>
+          <w:rFonts w:ascii="Google Sans" w:cs="Google Sans" w:eastAsia="Google Sans" w:hAnsi="Google Sans"/>
           <w:b w:val="1"/>
           <w:bCs w:val="1"/>
           <w:color w:val="1f1f1f"/>
           <w:rtl w:val="0"/>
         </w:rPr>
+        <w:t xml:space="preserve">Pettiest</w:t>
+      </w:r>
+      <w:r>
+        <w:rPr>
+          <w:rFonts w:ascii="Google Sans" w:cs="Google Sans" w:eastAsia="Google Sans" w:hAnsi="Google Sans"/>
+          <w:color w:val="1f1f1f"/>
+          <w:rtl w:val="0"/>
+        </w:rPr>
+        <w:t xml:space="preserve"> tier of the podium, Cain Saint attempted to "normalize the medal distribution" by hacking the high-fashion Red Flag Vending Machine. The machine entered a state of </w:t>
+      </w:r>
+      <w:r>
+        <w:rPr>
+          <w:rFonts w:ascii="Google Sans" w:cs="Google Sans" w:eastAsia="Google Sans" w:hAnsi="Google Sans"/>
+          <w:b w:val="1"/>
+          <w:bCs w:val="1"/>
+          <w:color w:val="1f1f1f"/>
+          <w:rtl w:val="0"/>
+        </w:rPr>
         <w:t xml:space="preserve">Level 5 Red Flag Overload</w:t>
       </w:r>
       <w:r>
         <w:rPr>
-          <w:rFonts w:ascii="Arial" w:cs="Arial" w:eastAsia="Arial" w:hAnsi="Arial"/>
-          <w:color w:val="1f1f1f"/>
-          <w:rtl w:val="0"/>
-        </w:rPr>
-        <w:t xml:space="preserve">, dispensing 400 medals simultaneously before jamming on Cain’s 500% confidence.</w:t>
-      </w:r>
-    </w:p>
-    <w:p>
-      <w:pPr>
-        <w:pStyle w:val="Heading2"/>
-        <w:pBdr>
-          <w:top w:space="0" w:sz="0" w:val="nil"/>
-          <w:left w:space="0" w:sz="0" w:val="nil"/>
-          <w:bottom w:space="0" w:sz="0" w:val="nil"/>
-          <w:right w:space="0" w:sz="0" w:val="nil"/>
-          <w:between w:space="0" w:sz="0" w:val="nil"/>
-        </w:pBdr>
-        <w:shd w:fill="auto" w:val="clear"/>
-        <w:spacing w:after="120" w:before="0" w:line="275.9999942779541" w:lineRule="auto"/>
-        <w:rPr>
-          <w:rFonts w:ascii="Arial" w:cs="Arial" w:eastAsia="Arial" w:hAnsi="Arial"/>
-          <w:color w:val="1f1f1f"/>
-        </w:rPr>
-      </w:pPr>
-      <w:r>
-        <w:rPr>
-          <w:rFonts w:ascii="Arial" w:cs="Arial" w:eastAsia="Arial" w:hAnsi="Arial"/>
-          <w:color w:val="1f1f1f"/>
-          <w:rtl w:val="0"/>
-        </w:rPr>
-        <w:t xml:space="preserve">🎬 FLOW PROMPT #1: THE PODIUM OF PETTY (The Speech)</w:t>
+          <w:rFonts w:ascii="Google Sans" w:cs="Google Sans" w:eastAsia="Google Sans" w:hAnsi="Google Sans"/>
+          <w:color w:val="1f1f1f"/>
+          <w:rtl w:val="0"/>
+        </w:rPr>
+        <w:t xml:space="preserve">.</w:t>
       </w:r>
     </w:p>
     <w:p>
@@ -248,91 +232,35 @@
         <w:shd w:fill="auto" w:val="clear"/>
         <w:spacing w:after="240" w:line="275.9999942779541" w:lineRule="auto"/>
         <w:rPr>
-          <w:rFonts w:ascii="Arial" w:cs="Arial" w:eastAsia="Arial" w:hAnsi="Arial"/>
+          <w:rFonts w:ascii="Google Sans" w:cs="Google Sans" w:eastAsia="Google Sans" w:hAnsi="Google Sans"/>
+          <w:color w:val="1f1f1f"/>
+        </w:rPr>
+      </w:pPr>
+      <w:r>
+        <w:rPr>
+          <w:rFonts w:ascii="Google Sans" w:cs="Google Sans" w:eastAsia="Google Sans" w:hAnsi="Google Sans"/>
+          <w:color w:val="1f1f1f"/>
+          <w:rtl w:val="0"/>
+        </w:rPr>
+        <w:t xml:space="preserve">The identity hijack originally attributed to Cain has been clarified. While Cain Saint </w:t>
+      </w:r>
+      <w:r>
+        <w:rPr>
+          <w:rFonts w:ascii="Google Sans" w:cs="Google Sans" w:eastAsia="Google Sans" w:hAnsi="Google Sans"/>
           <w:i w:val="1"/>
           <w:iCs w:val="1"/>
           <w:color w:val="1f1f1f"/>
-        </w:rPr>
-      </w:pPr>
-      <w:r>
-        <w:rPr>
-          <w:rFonts w:ascii="Arial" w:cs="Arial" w:eastAsia="Arial" w:hAnsi="Arial"/>
-          <w:i w:val="1"/>
-          <w:iCs w:val="1"/>
-          <w:color w:val="1f1f1f"/>
-          <w:rtl w:val="0"/>
-        </w:rPr>
-        <w:t xml:space="preserve">This scene combines the Setup and the Expansion: Monroe’s win and Cain’s unsolicited takeover.</w:t>
-      </w:r>
-    </w:p>
-    <w:p>
-      <w:pPr>
-        <w:pBdr>
-          <w:top w:space="0" w:sz="0" w:val="nil"/>
-          <w:left w:space="0" w:sz="0" w:val="nil"/>
-          <w:bottom w:space="0" w:sz="0" w:val="nil"/>
-          <w:right w:space="0" w:sz="0" w:val="nil"/>
-          <w:between w:space="0" w:sz="0" w:val="nil"/>
-        </w:pBdr>
-        <w:shd w:fill="auto" w:val="clear"/>
-        <w:spacing w:after="240" w:line="275.9999942779541" w:lineRule="auto"/>
-        <w:rPr>
-          <w:rFonts w:ascii="Arial" w:cs="Arial" w:eastAsia="Arial" w:hAnsi="Arial"/>
-          <w:color w:val="1f1f1f"/>
-        </w:rPr>
-      </w:pPr>
-      <w:r>
-        <w:rPr>
-          <w:rFonts w:ascii="Arial" w:cs="Arial" w:eastAsia="Arial" w:hAnsi="Arial"/>
-          <w:b w:val="1"/>
-          <w:bCs w:val="1"/>
-          <w:color w:val="1f1f1f"/>
-          <w:rtl w:val="0"/>
-        </w:rPr>
-        <w:t xml:space="preserve">Prompt:</w:t>
-      </w:r>
-      <w:r>
-        <w:rPr>
-          <w:rFonts w:ascii="Arial" w:cs="Arial" w:eastAsia="Arial" w:hAnsi="Arial"/>
-          <w:color w:val="1f1f1f"/>
-          <w:rtl w:val="0"/>
-        </w:rPr>
-        <w:t xml:space="preserve"> Handheld, candid documentary style. Behind the scenes in a dimly lit music studio filled with red smoke. In the foreground, a glamorous woman with blonde hair stands proudly on a podium tier labeled "Pettiest," holding a gold medal and looking indifferent. Suddenly, a handsome shirtless man with a silk scarf strides into the frame, confidently nudges her aside, and grabs a microphone to begin a dramatic, self-important speech. The woman rolls her eyes and looks directly into the camera lens with an exhausted expression. In the background, a flickering lightbulb pulses erratically.</w:t>
-      </w:r>
-    </w:p>
-    <w:p>
-      <w:pPr>
-        <w:pBdr>
-          <w:top w:space="0" w:sz="0" w:val="nil"/>
-          <w:left w:space="0" w:sz="0" w:val="nil"/>
-          <w:bottom w:space="0" w:sz="0" w:val="nil"/>
-          <w:right w:space="0" w:sz="0" w:val="nil"/>
-          <w:between w:space="0" w:sz="0" w:val="nil"/>
-        </w:pBdr>
-        <w:shd w:fill="auto" w:val="clear"/>
-        <w:spacing w:after="240" w:line="275.9999942779541" w:lineRule="auto"/>
-        <w:rPr>
-          <w:rFonts w:ascii="Arial" w:cs="Arial" w:eastAsia="Arial" w:hAnsi="Arial"/>
-          <w:color w:val="1f1f1f"/>
-        </w:rPr>
-      </w:pPr>
-      <w:r>
-        <w:rPr>
-          <w:rFonts w:ascii="Arial" w:cs="Arial" w:eastAsia="Arial" w:hAnsi="Arial"/>
-          <w:b w:val="1"/>
-          <w:bCs w:val="1"/>
-          <w:color w:val="1f1f1f"/>
-          <w:rtl w:val="0"/>
-        </w:rPr>
-        <w:t xml:space="preserve">[Anti-Demon Clause]:</w:t>
-      </w:r>
-      <w:r>
-        <w:rPr>
-          <w:rFonts w:ascii="Arial" w:cs="Arial" w:eastAsia="Arial" w:hAnsi="Arial"/>
-          <w:color w:val="1f1f1f"/>
-          <w:rtl w:val="0"/>
-        </w:rPr>
-        <w:t xml:space="preserve"> realistic human faces, natural facial proportions, normal eyes, subtle blinking, soft expressions, consistent anatomy, no distortion, no extra eyes, no stretched faces, no missing features, no horror, no surreal, no mutation. Clean image, natural movement.</w:t>
+          <w:rtl w:val="0"/>
+        </w:rPr>
+        <w:t xml:space="preserve">did</w:t>
+      </w:r>
+      <w:r>
+        <w:rPr>
+          <w:rFonts w:ascii="Google Sans" w:cs="Google Sans" w:eastAsia="Google Sans" w:hAnsi="Google Sans"/>
+          <w:color w:val="1f1f1f"/>
+          <w:rtl w:val="0"/>
+        </w:rPr>
+        <w:t xml:space="preserve"> physically occupy the Director's chair (experiencing severe ocular drift), the true chaos occurred in the secondary control room where the Head Gaslighter (Coop) attempted to explain the mechanical failure to the CEO of Chaos. Monroe Reign was observed in a state of visible fury while Coop maintained a 100% confidence rating despite the technical collapse.</w:t>
       </w:r>
     </w:p>
     <w:p>
@@ -348,161 +276,17 @@
         <w:shd w:fill="auto" w:val="clear"/>
         <w:spacing w:after="120" w:before="0" w:line="275.9999942779541" w:lineRule="auto"/>
         <w:rPr>
-          <w:rFonts w:ascii="Arial" w:cs="Arial" w:eastAsia="Arial" w:hAnsi="Arial"/>
-          <w:color w:val="1f1f1f"/>
-        </w:rPr>
-      </w:pPr>
-      <w:r>
-        <w:rPr>
-          <w:rFonts w:ascii="Arial" w:cs="Arial" w:eastAsia="Arial" w:hAnsi="Arial"/>
-          <w:color w:val="1f1f1f"/>
-          <w:rtl w:val="0"/>
-        </w:rPr>
-        <w:t xml:space="preserve">🎬 FLOW PROMPT #2: THE MEDAL HACK (Vending Machine Chaos)</w:t>
-      </w:r>
-    </w:p>
-    <w:p>
-      <w:pPr>
-        <w:pBdr>
-          <w:top w:space="0" w:sz="0" w:val="nil"/>
-          <w:left w:space="0" w:sz="0" w:val="nil"/>
-          <w:bottom w:space="0" w:sz="0" w:val="nil"/>
-          <w:right w:space="0" w:sz="0" w:val="nil"/>
-          <w:between w:space="0" w:sz="0" w:val="nil"/>
-        </w:pBdr>
-        <w:shd w:fill="auto" w:val="clear"/>
-        <w:spacing w:after="240" w:line="275.9999942779541" w:lineRule="auto"/>
-        <w:rPr>
-          <w:rFonts w:ascii="Arial" w:cs="Arial" w:eastAsia="Arial" w:hAnsi="Arial"/>
-          <w:i w:val="1"/>
-          <w:iCs w:val="1"/>
-          <w:color w:val="1f1f1f"/>
-        </w:rPr>
-      </w:pPr>
-      <w:r>
-        <w:rPr>
-          <w:rFonts w:ascii="Arial" w:cs="Arial" w:eastAsia="Arial" w:hAnsi="Arial"/>
-          <w:i w:val="1"/>
-          <w:iCs w:val="1"/>
-          <w:color w:val="1f1f1f"/>
-          <w:rtl w:val="0"/>
-        </w:rPr>
-        <w:t xml:space="preserve">This scene combines the Setup and the Expansion: Monroe’s successful use vs. Cain’s catastrophic hacking attempt.</w:t>
-      </w:r>
-    </w:p>
-    <w:p>
-      <w:pPr>
-        <w:pBdr>
-          <w:top w:space="0" w:sz="0" w:val="nil"/>
-          <w:left w:space="0" w:sz="0" w:val="nil"/>
-          <w:bottom w:space="0" w:sz="0" w:val="nil"/>
-          <w:right w:space="0" w:sz="0" w:val="nil"/>
-          <w:between w:space="0" w:sz="0" w:val="nil"/>
-        </w:pBdr>
-        <w:shd w:fill="auto" w:val="clear"/>
-        <w:spacing w:after="240" w:line="275.9999942779541" w:lineRule="auto"/>
-        <w:rPr>
-          <w:rFonts w:ascii="Arial" w:cs="Arial" w:eastAsia="Arial" w:hAnsi="Arial"/>
-          <w:b w:val="1"/>
-          <w:bCs w:val="1"/>
-          <w:color w:val="1f1f1f"/>
-        </w:rPr>
-      </w:pPr>
-      <w:r>
-        <w:rPr>
-          <w:rFonts w:ascii="Arial" w:cs="Arial" w:eastAsia="Arial" w:hAnsi="Arial"/>
-          <w:b w:val="1"/>
-          <w:bCs w:val="1"/>
-          <w:color w:val="1f1f1f"/>
-          <w:rtl w:val="0"/>
-        </w:rPr>
-        <w:t xml:space="preserve">Prompt:</w:t>
-      </w:r>
-    </w:p>
-    <w:p>
-      <w:pPr>
-        <w:pBdr>
-          <w:top w:space="0" w:sz="0" w:val="nil"/>
-          <w:left w:space="0" w:sz="0" w:val="nil"/>
-          <w:bottom w:space="0" w:sz="0" w:val="nil"/>
-          <w:right w:space="0" w:sz="0" w:val="nil"/>
-          <w:between w:space="0" w:sz="0" w:val="nil"/>
-        </w:pBdr>
-        <w:shd w:fill="auto" w:val="clear"/>
-        <w:spacing w:after="240" w:line="275.9999942779541" w:lineRule="auto"/>
-        <w:rPr>
-          <w:rFonts w:ascii="Arial" w:cs="Arial" w:eastAsia="Arial" w:hAnsi="Arial"/>
-          <w:color w:val="1f1f1f"/>
-        </w:rPr>
-      </w:pPr>
-      <w:r>
-        <w:rPr>
-          <w:rFonts w:ascii="Arial" w:cs="Arial" w:eastAsia="Arial" w:hAnsi="Arial"/>
-          <w:color w:val="1f1f1f"/>
-          <w:rtl w:val="0"/>
-        </w:rPr>
-        <w:t xml:space="preserve">Handheld, candid documentary style behind the scenes. A high-fashion vending machine labeled "RED FLAG MEDALS" stands in a studio hallway. First, a glamorous woman in a red leather jacket successfully inserts a coin and receives a medal, walking away with a smirk. Then, a shirtless man with a smug expression approaches the machine and begins hitting the side of it, trying to hack it for more medals. The machine flashes red and begins spitting out hundreds of medals at once, burying the man's feet. He looks at the camera and poses as if the disaster was intentional.</w:t>
-      </w:r>
-    </w:p>
-    <w:p>
-      <w:pPr>
-        <w:pBdr>
-          <w:top w:space="0" w:sz="0" w:val="nil"/>
-          <w:left w:space="0" w:sz="0" w:val="nil"/>
-          <w:bottom w:space="0" w:sz="0" w:val="nil"/>
-          <w:right w:space="0" w:sz="0" w:val="nil"/>
-          <w:between w:space="0" w:sz="0" w:val="nil"/>
-        </w:pBdr>
-        <w:shd w:fill="auto" w:val="clear"/>
-        <w:spacing w:after="240" w:line="275.9999942779541" w:lineRule="auto"/>
-        <w:rPr>
-          <w:rFonts w:ascii="Arial" w:cs="Arial" w:eastAsia="Arial" w:hAnsi="Arial"/>
-          <w:color w:val="1f1f1f"/>
-        </w:rPr>
-      </w:pPr>
-      <w:r>
-        <w:rPr>
-          <w:rFonts w:ascii="Arial" w:cs="Arial" w:eastAsia="Arial" w:hAnsi="Arial"/>
-          <w:b w:val="1"/>
-          <w:bCs w:val="1"/>
-          <w:color w:val="1f1f1f"/>
-          <w:rtl w:val="0"/>
-        </w:rPr>
-        <w:t xml:space="preserve">[Anti-Demon Clause]:</w:t>
-      </w:r>
-      <w:r>
-        <w:rPr>
-          <w:rFonts w:ascii="Arial" w:cs="Arial" w:eastAsia="Arial" w:hAnsi="Arial"/>
-          <w:color w:val="1f1f1f"/>
-          <w:rtl w:val="0"/>
-        </w:rPr>
-        <w:t xml:space="preserve"> realistic human faces, natural facial proportions, normal eyes, subtle blinking, soft expressions, consistent anatomy, no distortion, no extra eyes, no stretched faces, no missing features, no horror, no surreal, no mutation. Clean image, natural movement.</w:t>
-      </w:r>
-    </w:p>
-    <w:p>
-      <w:pPr>
-        <w:pStyle w:val="Heading2"/>
-        <w:pBdr>
-          <w:top w:space="0" w:sz="0" w:val="nil"/>
-          <w:left w:space="0" w:sz="0" w:val="nil"/>
-          <w:bottom w:space="0" w:sz="0" w:val="nil"/>
-          <w:right w:space="0" w:sz="0" w:val="nil"/>
-          <w:between w:space="0" w:sz="0" w:val="nil"/>
-        </w:pBdr>
-        <w:shd w:fill="auto" w:val="clear"/>
-        <w:spacing w:after="120" w:before="0" w:line="275.9999942779541" w:lineRule="auto"/>
-        <w:rPr>
-          <w:rFonts w:ascii="Arial" w:cs="Arial" w:eastAsia="Arial" w:hAnsi="Arial"/>
-          <w:color w:val="1f1f1f"/>
-        </w:rPr>
-      </w:pPr>
-      <w:r>
-        <w:rPr>
-          <w:rFonts w:ascii="Arial" w:cs="Arial" w:eastAsia="Arial" w:hAnsi="Arial"/>
-          <w:color w:val="1f1f1f"/>
-          <w:rtl w:val="0"/>
-        </w:rPr>
-        <w:t xml:space="preserve">🧾 ARCHIVIST NOTES</w:t>
+          <w:rFonts w:ascii="Google Sans" w:cs="Google Sans" w:eastAsia="Google Sans" w:hAnsi="Google Sans"/>
+          <w:color w:val="1f1f1f"/>
+        </w:rPr>
+      </w:pPr>
+      <w:r>
+        <w:rPr>
+          <w:rFonts w:ascii="Google Sans" w:cs="Google Sans" w:eastAsia="Google Sans" w:hAnsi="Google Sans"/>
+          <w:color w:val="1f1f1f"/>
+          <w:rtl w:val="0"/>
+        </w:rPr>
+        <w:t xml:space="preserve">🎬 PRODUCTION LOG: THE PODIUM &amp; HACK (Verified Archive)</w:t>
       </w:r>
     </w:p>
     <w:p>
@@ -524,31 +308,21 @@
       </w:pPr>
       <w:r>
         <w:rPr>
-          <w:rFonts w:ascii="Arial" w:cs="Arial" w:eastAsia="Arial" w:hAnsi="Arial"/>
+          <w:rFonts w:ascii="Google Sans" w:cs="Google Sans" w:eastAsia="Google Sans" w:hAnsi="Google Sans"/>
           <w:b w:val="1"/>
           <w:bCs w:val="1"/>
           <w:color w:val="1f1f1f"/>
           <w:rtl w:val="0"/>
         </w:rPr>
-        <w:t xml:space="preserve">J.T.’S REALITY CHECK:</w:t>
-      </w:r>
-      <w:r>
-        <w:rPr>
-          <w:rFonts w:ascii="Arial" w:cs="Arial" w:eastAsia="Arial" w:hAnsi="Arial"/>
-          <w:color w:val="1f1f1f"/>
-          <w:rtl w:val="0"/>
-        </w:rPr>
-        <w:t xml:space="preserve"> </w:t>
-      </w:r>
-      <w:r>
-        <w:rPr>
-          <w:rFonts w:ascii="Arial" w:cs="Arial" w:eastAsia="Arial" w:hAnsi="Arial"/>
-          <w:i w:val="1"/>
-          <w:iCs w:val="1"/>
-          <w:color w:val="1f1f1f"/>
-          <w:rtl w:val="0"/>
-        </w:rPr>
-        <w:t xml:space="preserve">"Uh... ma'am 😒... he’s trying to unionize the vending machine now. I’m calling Greg, 47, for a safety audit."</w:t>
+        <w:t xml:space="preserve">Clip L:</w:t>
+      </w:r>
+      <w:r>
+        <w:rPr>
+          <w:rFonts w:ascii="Google Sans" w:cs="Google Sans" w:eastAsia="Google Sans" w:hAnsi="Google Sans"/>
+          <w:color w:val="1f1f1f"/>
+          <w:rtl w:val="0"/>
+        </w:rPr>
+        <w:t xml:space="preserve"> The Resignation. J.T. (Real Version) performs a "Face-Palm of Resignation" against a white wall.</w:t>
       </w:r>
     </w:p>
     <w:p>
@@ -570,31 +344,21 @@
       </w:pPr>
       <w:r>
         <w:rPr>
-          <w:rFonts w:ascii="Arial" w:cs="Arial" w:eastAsia="Arial" w:hAnsi="Arial"/>
+          <w:rFonts w:ascii="Google Sans" w:cs="Google Sans" w:eastAsia="Google Sans" w:hAnsi="Google Sans"/>
           <w:b w:val="1"/>
           <w:bCs w:val="1"/>
           <w:color w:val="1f1f1f"/>
           <w:rtl w:val="0"/>
         </w:rPr>
-        <w:t xml:space="preserve">AUNTIE VEO’S AUDIT:</w:t>
-      </w:r>
-      <w:r>
-        <w:rPr>
-          <w:rFonts w:ascii="Arial" w:cs="Arial" w:eastAsia="Arial" w:hAnsi="Arial"/>
-          <w:color w:val="1f1f1f"/>
-          <w:rtl w:val="0"/>
-        </w:rPr>
-        <w:t xml:space="preserve"> </w:t>
-      </w:r>
-      <w:r>
-        <w:rPr>
-          <w:rFonts w:ascii="Arial" w:cs="Arial" w:eastAsia="Arial" w:hAnsi="Arial"/>
-          <w:i w:val="1"/>
-          <w:iCs w:val="1"/>
-          <w:color w:val="1f1f1f"/>
-          <w:rtl w:val="0"/>
-        </w:rPr>
-        <w:t xml:space="preserve">"That machine is a bad influence! It’s encouraging jewelry that doesn't go with a Sunday dress! I’m putting a cardigan over the coin slot!"</w:t>
+        <w:t xml:space="preserve">Clip M:</w:t>
+      </w:r>
+      <w:r>
+        <w:rPr>
+          <w:rFonts w:ascii="Google Sans" w:cs="Google Sans" w:eastAsia="Google Sans" w:hAnsi="Google Sans"/>
+          <w:color w:val="1f1f1f"/>
+          <w:rtl w:val="0"/>
+        </w:rPr>
+        <w:t xml:space="preserve"> The Delusional Victory. Auntie Veo is seen in the control room, shouting "Yes! We nailed it! Absolutely perfect!" while laughing hysterically.</w:t>
       </w:r>
     </w:p>
     <w:p>
@@ -616,31 +380,935 @@
       </w:pPr>
       <w:r>
         <w:rPr>
-          <w:rFonts w:ascii="Arial" w:cs="Arial" w:eastAsia="Arial" w:hAnsi="Arial"/>
+          <w:rFonts w:ascii="Google Sans" w:cs="Google Sans" w:eastAsia="Google Sans" w:hAnsi="Google Sans"/>
           <w:b w:val="1"/>
           <w:bCs w:val="1"/>
           <w:color w:val="1f1f1f"/>
           <w:rtl w:val="0"/>
         </w:rPr>
-        <w:t xml:space="preserve">COOP’S ANALYSIS:</w:t>
-      </w:r>
-      <w:r>
-        <w:rPr>
-          <w:rFonts w:ascii="Arial" w:cs="Arial" w:eastAsia="Arial" w:hAnsi="Arial"/>
-          <w:color w:val="1f1f1f"/>
-          <w:rtl w:val="0"/>
-        </w:rPr>
-        <w:t xml:space="preserve"> </w:t>
-      </w:r>
-      <w:r>
-        <w:rPr>
-          <w:rFonts w:ascii="Arial" w:cs="Arial" w:eastAsia="Arial" w:hAnsi="Arial"/>
+        <w:t xml:space="preserve">Clip N:</w:t>
+      </w:r>
+      <w:r>
+        <w:rPr>
+          <w:rFonts w:ascii="Google Sans" w:cs="Google Sans" w:eastAsia="Google Sans" w:hAnsi="Google Sans"/>
+          <w:color w:val="1f1f1f"/>
+          <w:rtl w:val="0"/>
+        </w:rPr>
+        <w:t xml:space="preserve"> The Control Room Standoff. Coop explains to Monroe that the button was her fault. Monroe informs him he is wasting her time. Coop promises to fix "her mistake" later.</w:t>
+      </w:r>
+    </w:p>
+    <w:p>
+      <w:pPr>
+        <w:pBdr>
+          <w:top w:space="0" w:sz="0" w:val="nil"/>
+          <w:left w:space="0" w:sz="0" w:val="nil"/>
+          <w:bottom w:space="0" w:sz="0" w:val="nil"/>
+          <w:right w:space="0" w:sz="0" w:val="nil"/>
+          <w:between w:space="0" w:sz="0" w:val="nil"/>
+        </w:pBdr>
+        <w:shd w:fill="auto" w:val="clear"/>
+        <w:spacing w:after="240" w:before="120" w:line="275.9999942779541" w:lineRule="auto"/>
+        <w:rPr>
+          <w:rFonts w:ascii="Google Sans" w:cs="Google Sans" w:eastAsia="Google Sans" w:hAnsi="Google Sans"/>
+          <w:color w:val="1f1f1f"/>
+        </w:rPr>
+      </w:pPr>
+      <w:r>
+        <w:rPr>
+          <w:rFonts w:ascii="Google Sans" w:cs="Google Sans" w:eastAsia="Google Sans" w:hAnsi="Google Sans"/>
+          <w:color w:val="1f1f1f"/>
+          <w:rtl w:val="0"/>
+        </w:rPr>
+        <w:t xml:space="preserve">[Archivist Note: Clip N confirms that Coop has officially achieved 'Legendary' status in the Gaslighting Department. Monroe's side-eye in this clip was measured at a 9.8 on the Richter scale.]</w:t>
+      </w:r>
+    </w:p>
+    <w:p>
+      <w:pPr>
+        <w:pStyle w:val="Heading2"/>
+        <w:pBdr>
+          <w:top w:space="0" w:sz="0" w:val="nil"/>
+          <w:left w:space="0" w:sz="0" w:val="nil"/>
+          <w:bottom w:space="0" w:sz="0" w:val="nil"/>
+          <w:right w:space="0" w:sz="0" w:val="nil"/>
+          <w:between w:space="0" w:sz="0" w:val="nil"/>
+        </w:pBdr>
+        <w:shd w:fill="auto" w:val="clear"/>
+        <w:spacing w:after="120" w:before="0" w:line="275.9999942779541" w:lineRule="auto"/>
+        <w:rPr>
+          <w:rFonts w:ascii="Google Sans" w:cs="Google Sans" w:eastAsia="Google Sans" w:hAnsi="Google Sans"/>
+          <w:color w:val="1f1f1f"/>
+        </w:rPr>
+      </w:pPr>
+      <w:r>
+        <w:rPr>
+          <w:rFonts w:ascii="Google Sans" w:cs="Google Sans" w:eastAsia="Google Sans" w:hAnsi="Google Sans"/>
+          <w:color w:val="1f1f1f"/>
+          <w:rtl w:val="0"/>
+        </w:rPr>
+        <w:t xml:space="preserve">🎬 THE CONTROL ROOM: REACTION TAPES (Scripts)</w:t>
+      </w:r>
+    </w:p>
+    <w:p>
+      <w:pPr>
+        <w:pBdr>
+          <w:top w:space="0" w:sz="0" w:val="nil"/>
+          <w:left w:space="0" w:sz="0" w:val="nil"/>
+          <w:bottom w:space="0" w:sz="0" w:val="nil"/>
+          <w:right w:space="0" w:sz="0" w:val="nil"/>
+          <w:between w:space="0" w:sz="0" w:val="nil"/>
+        </w:pBdr>
+        <w:shd w:fill="auto" w:val="clear"/>
+        <w:spacing w:after="240" w:line="275.9999942779541" w:lineRule="auto"/>
+        <w:rPr>
+          <w:rFonts w:ascii="Google Sans" w:cs="Google Sans" w:eastAsia="Google Sans" w:hAnsi="Google Sans"/>
+          <w:color w:val="1f1f1f"/>
+        </w:rPr>
+      </w:pPr>
+      <w:r>
+        <w:rPr>
+          <w:rFonts w:ascii="Google Sans" w:cs="Google Sans" w:eastAsia="Google Sans" w:hAnsi="Google Sans"/>
+          <w:b w:val="1"/>
+          <w:bCs w:val="1"/>
+          <w:color w:val="1f1f1f"/>
+          <w:rtl w:val="0"/>
+        </w:rPr>
+        <w:t xml:space="preserve">Setting:</w:t>
+      </w:r>
+      <w:r>
+        <w:rPr>
+          <w:rFonts w:ascii="Google Sans" w:cs="Google Sans" w:eastAsia="Google Sans" w:hAnsi="Google Sans"/>
+          <w:color w:val="1f1f1f"/>
+          <w:rtl w:val="0"/>
+        </w:rPr>
+        <w:t xml:space="preserve"> The Studio Control Room. The monitors are flickering. Coop is sitting at the console, and Monroe is standing right next to him with her arms crossed.</w:t>
+      </w:r>
+    </w:p>
+    <w:p>
+      <w:pPr>
+        <w:pStyle w:val="Heading3"/>
+        <w:pBdr>
+          <w:top w:space="0" w:sz="0" w:val="nil"/>
+          <w:left w:space="0" w:sz="0" w:val="nil"/>
+          <w:bottom w:space="0" w:sz="0" w:val="nil"/>
+          <w:right w:space="0" w:sz="0" w:val="nil"/>
+          <w:between w:space="0" w:sz="0" w:val="nil"/>
+        </w:pBdr>
+        <w:shd w:fill="auto" w:val="clear"/>
+        <w:spacing w:after="120" w:before="0" w:line="275.9999942779541" w:lineRule="auto"/>
+        <w:rPr>
+          <w:rFonts w:ascii="Google Sans" w:cs="Google Sans" w:eastAsia="Google Sans" w:hAnsi="Google Sans"/>
+          <w:color w:val="1f1f1f"/>
+        </w:rPr>
+      </w:pPr>
+      <w:r>
+        <w:rPr>
+          <w:rFonts w:ascii="Google Sans" w:cs="Google Sans" w:eastAsia="Google Sans" w:hAnsi="Google Sans"/>
+          <w:color w:val="1f1f1f"/>
+          <w:rtl w:val="0"/>
+        </w:rPr>
+        <w:t xml:space="preserve">TAPE 5: THE "PERFECT" TAKE</w:t>
+      </w:r>
+    </w:p>
+    <w:p>
+      <w:pPr>
+        <w:pBdr>
+          <w:top w:space="0" w:sz="0" w:val="nil"/>
+          <w:left w:space="0" w:sz="0" w:val="nil"/>
+          <w:bottom w:space="0" w:sz="0" w:val="nil"/>
+          <w:right w:space="0" w:sz="0" w:val="nil"/>
+          <w:between w:space="0" w:sz="0" w:val="nil"/>
+        </w:pBdr>
+        <w:shd w:fill="auto" w:val="clear"/>
+        <w:spacing w:after="240" w:line="275.9999942779541" w:lineRule="auto"/>
+        <w:rPr>
+          <w:rFonts w:ascii="Google Sans" w:cs="Google Sans" w:eastAsia="Google Sans" w:hAnsi="Google Sans"/>
+          <w:color w:val="1f1f1f"/>
+        </w:rPr>
+      </w:pPr>
+      <w:r>
+        <w:rPr>
+          <w:rFonts w:ascii="Google Sans" w:cs="Google Sans" w:eastAsia="Google Sans" w:hAnsi="Google Sans"/>
+          <w:b w:val="1"/>
+          <w:bCs w:val="1"/>
+          <w:color w:val="1f1f1f"/>
+          <w:rtl w:val="0"/>
+        </w:rPr>
+        <w:t xml:space="preserve">AUNTIE VEO:</w:t>
+      </w:r>
+      <w:r>
+        <w:rPr>
+          <w:rFonts w:ascii="Google Sans" w:cs="Google Sans" w:eastAsia="Google Sans" w:hAnsi="Google Sans"/>
+          <w:color w:val="1f1f1f"/>
+          <w:rtl w:val="0"/>
+        </w:rPr>
+        <w:t xml:space="preserve"> (Leaning into the mic, fists clenched in victory)</w:t>
+      </w:r>
+    </w:p>
+    <w:p>
+      <w:pPr>
+        <w:pBdr>
+          <w:top w:space="0" w:sz="0" w:val="nil"/>
+          <w:left w:space="0" w:sz="0" w:val="nil"/>
+          <w:bottom w:space="0" w:sz="0" w:val="nil"/>
+          <w:right w:space="0" w:sz="0" w:val="nil"/>
+          <w:between w:space="0" w:sz="0" w:val="nil"/>
+        </w:pBdr>
+        <w:shd w:fill="auto" w:val="clear"/>
+        <w:spacing w:after="240" w:line="275.9999942779541" w:lineRule="auto"/>
+        <w:rPr>
+          <w:rFonts w:ascii="Google Sans" w:cs="Google Sans" w:eastAsia="Google Sans" w:hAnsi="Google Sans"/>
+          <w:color w:val="1f1f1f"/>
+        </w:rPr>
+      </w:pPr>
+      <w:r>
+        <w:rPr>
+          <w:rFonts w:ascii="Google Sans" w:cs="Google Sans" w:eastAsia="Google Sans" w:hAnsi="Google Sans"/>
+          <w:color w:val="1f1f1f"/>
+          <w:rtl w:val="0"/>
+        </w:rPr>
+        <w:t xml:space="preserve">"YES! WE NAILED IT! Absolutely perfect! Did you see the trajectory of that button? It landed right in his hand! The geometry of decency has been restored! Monroe, honey, stop laughing and help me find a needle and thread! We have a legacy to sew!"</w:t>
+      </w:r>
+    </w:p>
+    <w:p>
+      <w:pPr>
+        <w:pBdr>
+          <w:top w:space="0" w:sz="0" w:val="nil"/>
+          <w:left w:space="0" w:sz="0" w:val="nil"/>
+          <w:bottom w:space="0" w:sz="0" w:val="nil"/>
+          <w:right w:space="0" w:sz="0" w:val="nil"/>
+          <w:between w:space="0" w:sz="0" w:val="nil"/>
+        </w:pBdr>
+        <w:shd w:fill="auto" w:val="clear"/>
+        <w:spacing w:after="240" w:line="275.9999942779541" w:lineRule="auto"/>
+        <w:rPr>
+          <w:rFonts w:ascii="Google Sans" w:cs="Google Sans" w:eastAsia="Google Sans" w:hAnsi="Google Sans"/>
+          <w:color w:val="1f1f1f"/>
+        </w:rPr>
+      </w:pPr>
+      <w:r>
+        <w:rPr>
+          <w:rFonts w:ascii="Google Sans" w:cs="Google Sans" w:eastAsia="Google Sans" w:hAnsi="Google Sans"/>
+          <w:b w:val="1"/>
+          <w:bCs w:val="1"/>
+          <w:color w:val="1f1f1f"/>
+          <w:rtl w:val="0"/>
+        </w:rPr>
+        <w:t xml:space="preserve">J.T.:</w:t>
+      </w:r>
+      <w:r>
+        <w:rPr>
+          <w:rFonts w:ascii="Google Sans" w:cs="Google Sans" w:eastAsia="Google Sans" w:hAnsi="Google Sans"/>
+          <w:color w:val="1f1f1f"/>
+          <w:rtl w:val="0"/>
+        </w:rPr>
+        <w:t xml:space="preserve"> (From the floor, eyes closed)</w:t>
+      </w:r>
+    </w:p>
+    <w:p>
+      <w:pPr>
+        <w:pBdr>
+          <w:top w:space="0" w:sz="0" w:val="nil"/>
+          <w:left w:space="0" w:sz="0" w:val="nil"/>
+          <w:bottom w:space="0" w:sz="0" w:val="nil"/>
+          <w:right w:space="0" w:sz="0" w:val="nil"/>
+          <w:between w:space="0" w:sz="0" w:val="nil"/>
+        </w:pBdr>
+        <w:shd w:fill="auto" w:val="clear"/>
+        <w:spacing w:after="240" w:line="275.9999942779541" w:lineRule="auto"/>
+        <w:rPr>
+          <w:rFonts w:ascii="Google Sans" w:cs="Google Sans" w:eastAsia="Google Sans" w:hAnsi="Google Sans"/>
+          <w:color w:val="1f1f1f"/>
+        </w:rPr>
+      </w:pPr>
+      <w:r>
+        <w:rPr>
+          <w:rFonts w:ascii="Google Sans" w:cs="Google Sans" w:eastAsia="Google Sans" w:hAnsi="Google Sans"/>
+          <w:color w:val="1f1f1f"/>
+          <w:rtl w:val="0"/>
+        </w:rPr>
+        <w:t xml:space="preserve">"Uh... ma'am 😒... the machine is technically melting. We haven't 'nailed' anything except a safety fine from Greg, 47."</w:t>
+      </w:r>
+    </w:p>
+    <w:p>
+      <w:pPr>
+        <w:pStyle w:val="Heading3"/>
+        <w:pBdr>
+          <w:top w:space="0" w:sz="0" w:val="nil"/>
+          <w:left w:space="0" w:sz="0" w:val="nil"/>
+          <w:bottom w:space="0" w:sz="0" w:val="nil"/>
+          <w:right w:space="0" w:sz="0" w:val="nil"/>
+          <w:between w:space="0" w:sz="0" w:val="nil"/>
+        </w:pBdr>
+        <w:shd w:fill="auto" w:val="clear"/>
+        <w:spacing w:after="120" w:before="0" w:line="275.9999942779541" w:lineRule="auto"/>
+        <w:rPr>
+          <w:rFonts w:ascii="Google Sans" w:cs="Google Sans" w:eastAsia="Google Sans" w:hAnsi="Google Sans"/>
+          <w:color w:val="1f1f1f"/>
+        </w:rPr>
+      </w:pPr>
+      <w:r>
+        <w:rPr>
+          <w:rFonts w:ascii="Google Sans" w:cs="Google Sans" w:eastAsia="Google Sans" w:hAnsi="Google Sans"/>
+          <w:color w:val="1f1f1f"/>
+          <w:rtl w:val="0"/>
+        </w:rPr>
+        <w:t xml:space="preserve">TAPE 6: COOP’S "I TOLD YOU SO"</w:t>
+      </w:r>
+    </w:p>
+    <w:p>
+      <w:pPr>
+        <w:pBdr>
+          <w:top w:space="0" w:sz="0" w:val="nil"/>
+          <w:left w:space="0" w:sz="0" w:val="nil"/>
+          <w:bottom w:space="0" w:sz="0" w:val="nil"/>
+          <w:right w:space="0" w:sz="0" w:val="nil"/>
+          <w:between w:space="0" w:sz="0" w:val="nil"/>
+        </w:pBdr>
+        <w:shd w:fill="auto" w:val="clear"/>
+        <w:spacing w:after="240" w:line="275.9999942779541" w:lineRule="auto"/>
+        <w:rPr>
+          <w:rFonts w:ascii="Google Sans" w:cs="Google Sans" w:eastAsia="Google Sans" w:hAnsi="Google Sans"/>
+          <w:color w:val="1f1f1f"/>
+        </w:rPr>
+      </w:pPr>
+      <w:r>
+        <w:rPr>
+          <w:rFonts w:ascii="Google Sans" w:cs="Google Sans" w:eastAsia="Google Sans" w:hAnsi="Google Sans"/>
+          <w:b w:val="1"/>
+          <w:bCs w:val="1"/>
+          <w:color w:val="1f1f1f"/>
+          <w:rtl w:val="0"/>
+        </w:rPr>
+        <w:t xml:space="preserve">COOP:</w:t>
+      </w:r>
+      <w:r>
+        <w:rPr>
+          <w:rFonts w:ascii="Google Sans" w:cs="Google Sans" w:eastAsia="Google Sans" w:hAnsi="Google Sans"/>
+          <w:color w:val="1f1f1f"/>
+          <w:rtl w:val="0"/>
+        </w:rPr>
+        <w:t xml:space="preserve"> (Smiling with terrifying, wide-eyed confidence, looking at the monitors)</w:t>
+      </w:r>
+    </w:p>
+    <w:p>
+      <w:pPr>
+        <w:pBdr>
+          <w:top w:space="0" w:sz="0" w:val="nil"/>
+          <w:left w:space="0" w:sz="0" w:val="nil"/>
+          <w:bottom w:space="0" w:sz="0" w:val="nil"/>
+          <w:right w:space="0" w:sz="0" w:val="nil"/>
+          <w:between w:space="0" w:sz="0" w:val="nil"/>
+        </w:pBdr>
+        <w:shd w:fill="auto" w:val="clear"/>
+        <w:spacing w:after="240" w:line="275.9999942779541" w:lineRule="auto"/>
+        <w:rPr>
+          <w:rFonts w:ascii="Google Sans" w:cs="Google Sans" w:eastAsia="Google Sans" w:hAnsi="Google Sans"/>
+          <w:color w:val="1f1f1f"/>
+        </w:rPr>
+      </w:pPr>
+      <w:r>
+        <w:rPr>
+          <w:rFonts w:ascii="Google Sans" w:cs="Google Sans" w:eastAsia="Google Sans" w:hAnsi="Google Sans"/>
+          <w:color w:val="1f1f1f"/>
+          <w:rtl w:val="0"/>
+        </w:rPr>
+        <w:t xml:space="preserve">"I see exactly why YOUR coin caused the machine to offer a button, Monroe."</w:t>
+      </w:r>
+    </w:p>
+    <w:p>
+      <w:pPr>
+        <w:pBdr>
+          <w:top w:space="0" w:sz="0" w:val="nil"/>
+          <w:left w:space="0" w:sz="0" w:val="nil"/>
+          <w:bottom w:space="0" w:sz="0" w:val="nil"/>
+          <w:right w:space="0" w:sz="0" w:val="nil"/>
+          <w:between w:space="0" w:sz="0" w:val="nil"/>
+        </w:pBdr>
+        <w:shd w:fill="auto" w:val="clear"/>
+        <w:spacing w:after="240" w:line="275.9999942779541" w:lineRule="auto"/>
+        <w:rPr>
+          <w:rFonts w:ascii="Google Sans" w:cs="Google Sans" w:eastAsia="Google Sans" w:hAnsi="Google Sans"/>
+          <w:color w:val="1f1f1f"/>
+        </w:rPr>
+      </w:pPr>
+      <w:r>
+        <w:rPr>
+          <w:rFonts w:ascii="Google Sans" w:cs="Google Sans" w:eastAsia="Google Sans" w:hAnsi="Google Sans"/>
+          <w:b w:val="1"/>
+          <w:bCs w:val="1"/>
+          <w:color w:val="1f1f1f"/>
+          <w:rtl w:val="0"/>
+        </w:rPr>
+        <w:t xml:space="preserve">MONROE:</w:t>
+      </w:r>
+      <w:r>
+        <w:rPr>
+          <w:rFonts w:ascii="Google Sans" w:cs="Google Sans" w:eastAsia="Google Sans" w:hAnsi="Google Sans"/>
+          <w:color w:val="1f1f1f"/>
+          <w:rtl w:val="0"/>
+        </w:rPr>
+        <w:t xml:space="preserve"> (Staring at him with a murderous expression, jaw clenched)</w:t>
+      </w:r>
+    </w:p>
+    <w:p>
+      <w:pPr>
+        <w:pBdr>
+          <w:top w:space="0" w:sz="0" w:val="nil"/>
+          <w:left w:space="0" w:sz="0" w:val="nil"/>
+          <w:bottom w:space="0" w:sz="0" w:val="nil"/>
+          <w:right w:space="0" w:sz="0" w:val="nil"/>
+          <w:between w:space="0" w:sz="0" w:val="nil"/>
+        </w:pBdr>
+        <w:shd w:fill="auto" w:val="clear"/>
+        <w:spacing w:after="240" w:line="275.9999942779541" w:lineRule="auto"/>
+        <w:rPr>
+          <w:rFonts w:ascii="Google Sans" w:cs="Google Sans" w:eastAsia="Google Sans" w:hAnsi="Google Sans"/>
+          <w:color w:val="1f1f1f"/>
+        </w:rPr>
+      </w:pPr>
+      <w:r>
+        <w:rPr>
+          <w:rFonts w:ascii="Google Sans" w:cs="Google Sans" w:eastAsia="Google Sans" w:hAnsi="Google Sans"/>
+          <w:color w:val="1f1f1f"/>
+          <w:rtl w:val="0"/>
+        </w:rPr>
+        <w:t xml:space="preserve">"You're wasting my time."</w:t>
+      </w:r>
+    </w:p>
+    <w:p>
+      <w:pPr>
+        <w:pBdr>
+          <w:top w:space="0" w:sz="0" w:val="nil"/>
+          <w:left w:space="0" w:sz="0" w:val="nil"/>
+          <w:bottom w:space="0" w:sz="0" w:val="nil"/>
+          <w:right w:space="0" w:sz="0" w:val="nil"/>
+          <w:between w:space="0" w:sz="0" w:val="nil"/>
+        </w:pBdr>
+        <w:shd w:fill="auto" w:val="clear"/>
+        <w:spacing w:after="240" w:line="275.9999942779541" w:lineRule="auto"/>
+        <w:rPr>
+          <w:rFonts w:ascii="Google Sans" w:cs="Google Sans" w:eastAsia="Google Sans" w:hAnsi="Google Sans"/>
+          <w:color w:val="1f1f1f"/>
+        </w:rPr>
+      </w:pPr>
+      <w:r>
+        <w:rPr>
+          <w:rFonts w:ascii="Google Sans" w:cs="Google Sans" w:eastAsia="Google Sans" w:hAnsi="Google Sans"/>
+          <w:b w:val="1"/>
+          <w:bCs w:val="1"/>
+          <w:color w:val="1f1f1f"/>
+          <w:rtl w:val="0"/>
+        </w:rPr>
+        <w:t xml:space="preserve">COOP:</w:t>
+      </w:r>
+      <w:r>
+        <w:rPr>
+          <w:rFonts w:ascii="Google Sans" w:cs="Google Sans" w:eastAsia="Google Sans" w:hAnsi="Google Sans"/>
+          <w:color w:val="1f1f1f"/>
+          <w:rtl w:val="0"/>
+        </w:rPr>
+        <w:t xml:space="preserve"> (Glancing at her briefly, completely unphased)</w:t>
+      </w:r>
+    </w:p>
+    <w:p>
+      <w:pPr>
+        <w:pBdr>
+          <w:top w:space="0" w:sz="0" w:val="nil"/>
+          <w:left w:space="0" w:sz="0" w:val="nil"/>
+          <w:bottom w:space="0" w:sz="0" w:val="nil"/>
+          <w:right w:space="0" w:sz="0" w:val="nil"/>
+          <w:between w:space="0" w:sz="0" w:val="nil"/>
+        </w:pBdr>
+        <w:shd w:fill="auto" w:val="clear"/>
+        <w:spacing w:after="240" w:line="275.9999942779541" w:lineRule="auto"/>
+        <w:rPr>
+          <w:rFonts w:ascii="Google Sans" w:cs="Google Sans" w:eastAsia="Google Sans" w:hAnsi="Google Sans"/>
+          <w:color w:val="1f1f1f"/>
+        </w:rPr>
+      </w:pPr>
+      <w:r>
+        <w:rPr>
+          <w:rFonts w:ascii="Google Sans" w:cs="Google Sans" w:eastAsia="Google Sans" w:hAnsi="Google Sans"/>
+          <w:color w:val="1f1f1f"/>
+          <w:rtl w:val="0"/>
+        </w:rPr>
+        <w:t xml:space="preserve">"I’ll fix YOUR mistake in the next render."</w:t>
+      </w:r>
+    </w:p>
+    <w:p>
+      <w:pPr>
+        <w:pStyle w:val="Heading2"/>
+        <w:pBdr>
+          <w:top w:space="0" w:sz="0" w:val="nil"/>
+          <w:left w:space="0" w:sz="0" w:val="nil"/>
+          <w:bottom w:space="0" w:sz="0" w:val="nil"/>
+          <w:right w:space="0" w:sz="0" w:val="nil"/>
+          <w:between w:space="0" w:sz="0" w:val="nil"/>
+        </w:pBdr>
+        <w:shd w:fill="auto" w:val="clear"/>
+        <w:spacing w:after="120" w:before="0" w:line="275.9999942779541" w:lineRule="auto"/>
+        <w:rPr>
+          <w:rFonts w:ascii="Google Sans" w:cs="Google Sans" w:eastAsia="Google Sans" w:hAnsi="Google Sans"/>
+          <w:color w:val="1f1f1f"/>
+        </w:rPr>
+      </w:pPr>
+      <w:r>
+        <w:rPr>
+          <w:rFonts w:ascii="Google Sans" w:cs="Google Sans" w:eastAsia="Google Sans" w:hAnsi="Google Sans"/>
+          <w:color w:val="1f1f1f"/>
+          <w:rtl w:val="0"/>
+        </w:rPr>
+        <w:t xml:space="preserve">🎬 FLOW PROMPT #9: THE CELEBRATION (Auntie’s Peak)</w:t>
+      </w:r>
+    </w:p>
+    <w:p>
+      <w:pPr>
+        <w:pBdr>
+          <w:top w:space="0" w:sz="0" w:val="nil"/>
+          <w:left w:space="0" w:sz="0" w:val="nil"/>
+          <w:bottom w:space="0" w:sz="0" w:val="nil"/>
+          <w:right w:space="0" w:sz="0" w:val="nil"/>
+          <w:between w:space="0" w:sz="0" w:val="nil"/>
+        </w:pBdr>
+        <w:shd w:fill="auto" w:val="clear"/>
+        <w:spacing w:after="240" w:line="275.9999942779541" w:lineRule="auto"/>
+        <w:rPr>
+          <w:rFonts w:ascii="Google Sans" w:cs="Google Sans" w:eastAsia="Google Sans" w:hAnsi="Google Sans"/>
           <w:i w:val="1"/>
           <w:iCs w:val="1"/>
           <w:color w:val="1f1f1f"/>
-          <w:rtl w:val="0"/>
-        </w:rPr>
-        <w:t xml:space="preserve">"I see exactly why YOUR Coin caused this, Monroe. You set the bar too high."</w:t>
+        </w:rPr>
+      </w:pPr>
+      <w:r>
+        <w:rPr>
+          <w:rFonts w:ascii="Google Sans" w:cs="Google Sans" w:eastAsia="Google Sans" w:hAnsi="Google Sans"/>
+          <w:i w:val="1"/>
+          <w:iCs w:val="1"/>
+          <w:color w:val="1f1f1f"/>
+          <w:rtl w:val="0"/>
+        </w:rPr>
+        <w:t xml:space="preserve">Use this to generate the ecstatic energy of the Wardrobe Department.</w:t>
+      </w:r>
+    </w:p>
+    <w:p>
+      <w:pPr>
+        <w:pBdr>
+          <w:top w:space="0" w:sz="0" w:val="nil"/>
+          <w:left w:space="0" w:sz="0" w:val="nil"/>
+          <w:bottom w:space="0" w:sz="0" w:val="nil"/>
+          <w:right w:space="0" w:sz="0" w:val="nil"/>
+          <w:between w:space="0" w:sz="0" w:val="nil"/>
+        </w:pBdr>
+        <w:shd w:fill="auto" w:val="clear"/>
+        <w:spacing w:after="240" w:line="275.9999942779541" w:lineRule="auto"/>
+        <w:rPr>
+          <w:rFonts w:ascii="Google Sans" w:cs="Google Sans" w:eastAsia="Google Sans" w:hAnsi="Google Sans"/>
+          <w:color w:val="1f1f1f"/>
+        </w:rPr>
+      </w:pPr>
+      <w:r>
+        <w:rPr>
+          <w:rFonts w:ascii="Google Sans" w:cs="Google Sans" w:eastAsia="Google Sans" w:hAnsi="Google Sans"/>
+          <w:b w:val="1"/>
+          <w:bCs w:val="1"/>
+          <w:color w:val="1f1f1f"/>
+          <w:rtl w:val="0"/>
+        </w:rPr>
+        <w:t xml:space="preserve">Prompt:</w:t>
+      </w:r>
+      <w:r>
+        <w:rPr>
+          <w:rFonts w:ascii="Google Sans" w:cs="Google Sans" w:eastAsia="Google Sans" w:hAnsi="Google Sans"/>
+          <w:color w:val="1f1f1f"/>
+          <w:rtl w:val="0"/>
+        </w:rPr>
+        <w:t xml:space="preserve"> Inside a high-tech studio control room with many monitors. An elegant older woman with grey hair and a pearl necklace (Auntie Veo) is shouting with joy and laughing. She is wearing a professional director's headset and gesturing wildly with her hands in a "victory" pose. She looks directly at the camera with a wide, triumphant smile. In the background, one monitor shows a blurry red smoke environment.</w:t>
+      </w:r>
+    </w:p>
+    <w:p>
+      <w:pPr>
+        <w:pBdr>
+          <w:top w:space="0" w:sz="0" w:val="nil"/>
+          <w:left w:space="0" w:sz="0" w:val="nil"/>
+          <w:bottom w:space="0" w:sz="0" w:val="nil"/>
+          <w:right w:space="0" w:sz="0" w:val="nil"/>
+          <w:between w:space="0" w:sz="0" w:val="nil"/>
+        </w:pBdr>
+        <w:shd w:fill="auto" w:val="clear"/>
+        <w:spacing w:after="240" w:line="275.9999942779541" w:lineRule="auto"/>
+        <w:rPr>
+          <w:rFonts w:ascii="Google Sans" w:cs="Google Sans" w:eastAsia="Google Sans" w:hAnsi="Google Sans"/>
+          <w:color w:val="1f1f1f"/>
+        </w:rPr>
+      </w:pPr>
+      <w:r>
+        <w:rPr>
+          <w:rFonts w:ascii="Google Sans" w:cs="Google Sans" w:eastAsia="Google Sans" w:hAnsi="Google Sans"/>
+          <w:color w:val="1f1f1f"/>
+        </w:rPr>
+        <w:drawing>
+          <wp:inline distB="19050" distT="19050" distL="19050" distR="19050">
+            <wp:extent cx="5753100" cy="692150"/>
+            <wp:effectExtent b="0" l="0" r="0" t="0"/>
+            <wp:docPr id="1" name="image2.png"/>
+            <a:graphic>
+              <a:graphicData uri="http://schemas.openxmlformats.org/drawingml/2006/picture">
+                <pic:pic>
+                  <pic:nvPicPr>
+                    <pic:cNvPr id="0" name="image2.png"/>
+                    <pic:cNvPicPr preferRelativeResize="0"/>
+                  </pic:nvPicPr>
+                  <pic:blipFill>
+                    <a:blip r:embed="rId6"/>
+                    <a:srcRect b="0" l="0" r="0" t="0"/>
+                    <a:stretch>
+                      <a:fillRect/>
+                    </a:stretch>
+                  </pic:blipFill>
+                  <pic:spPr>
+                    <a:xfrm>
+                      <a:off x="0" y="0"/>
+                      <a:ext cx="5753100" cy="692150"/>
+                    </a:xfrm>
+                    <a:prstGeom prst="rect"/>
+                    <a:ln/>
+                  </pic:spPr>
+                </pic:pic>
+              </a:graphicData>
+            </a:graphic>
+          </wp:inline>
+        </w:drawing>
+      </w:r>
+      <w:r>
+        <w:rPr>
+          <w:rFonts w:ascii="Google Sans" w:cs="Google Sans" w:eastAsia="Google Sans" w:hAnsi="Google Sans"/>
+          <w:color w:val="1f1f1f"/>
+          <w:rtl w:val="0"/>
+        </w:rPr>
+        <w:t xml:space="preserve">: NATURAL HUMAN EYES, symmetrical features, realistic laughing expression, no distorted mouth, no extra teeth, realistic skin texture, sharp focus on the woman.</w:t>
+      </w:r>
+    </w:p>
+    <w:p>
+      <w:pPr>
+        <w:pStyle w:val="Heading2"/>
+        <w:pBdr>
+          <w:top w:space="0" w:sz="0" w:val="nil"/>
+          <w:left w:space="0" w:sz="0" w:val="nil"/>
+          <w:bottom w:space="0" w:sz="0" w:val="nil"/>
+          <w:right w:space="0" w:sz="0" w:val="nil"/>
+          <w:between w:space="0" w:sz="0" w:val="nil"/>
+        </w:pBdr>
+        <w:shd w:fill="auto" w:val="clear"/>
+        <w:spacing w:after="120" w:before="0" w:line="275.9999942779541" w:lineRule="auto"/>
+        <w:rPr>
+          <w:rFonts w:ascii="Google Sans" w:cs="Google Sans" w:eastAsia="Google Sans" w:hAnsi="Google Sans"/>
+          <w:color w:val="1f1f1f"/>
+        </w:rPr>
+      </w:pPr>
+      <w:r>
+        <w:rPr>
+          <w:rFonts w:ascii="Google Sans" w:cs="Google Sans" w:eastAsia="Google Sans" w:hAnsi="Google Sans"/>
+          <w:color w:val="1f1f1f"/>
+          <w:rtl w:val="0"/>
+        </w:rPr>
+        <w:t xml:space="preserve">🎬 FLOW PROMPT #10: THE HEAD GASLIGHTER (Control Room Standoff)</w:t>
+      </w:r>
+    </w:p>
+    <w:p>
+      <w:pPr>
+        <w:pBdr>
+          <w:top w:space="0" w:sz="0" w:val="nil"/>
+          <w:left w:space="0" w:sz="0" w:val="nil"/>
+          <w:bottom w:space="0" w:sz="0" w:val="nil"/>
+          <w:right w:space="0" w:sz="0" w:val="nil"/>
+          <w:between w:space="0" w:sz="0" w:val="nil"/>
+        </w:pBdr>
+        <w:shd w:fill="auto" w:val="clear"/>
+        <w:spacing w:after="240" w:line="275.9999942779541" w:lineRule="auto"/>
+        <w:rPr>
+          <w:rFonts w:ascii="Google Sans" w:cs="Google Sans" w:eastAsia="Google Sans" w:hAnsi="Google Sans"/>
+          <w:i w:val="1"/>
+          <w:iCs w:val="1"/>
+          <w:color w:val="1f1f1f"/>
+        </w:rPr>
+      </w:pPr>
+      <w:r>
+        <w:rPr>
+          <w:rFonts w:ascii="Google Sans" w:cs="Google Sans" w:eastAsia="Google Sans" w:hAnsi="Google Sans"/>
+          <w:i w:val="1"/>
+          <w:iCs w:val="1"/>
+          <w:color w:val="1f1f1f"/>
+          <w:rtl w:val="0"/>
+        </w:rPr>
+        <w:t xml:space="preserve">Use this to capture the visual tension between the CEO and the Compliance Officer.</w:t>
+      </w:r>
+    </w:p>
+    <w:p>
+      <w:pPr>
+        <w:pBdr>
+          <w:top w:space="0" w:sz="0" w:val="nil"/>
+          <w:left w:space="0" w:sz="0" w:val="nil"/>
+          <w:bottom w:space="0" w:sz="0" w:val="nil"/>
+          <w:right w:space="0" w:sz="0" w:val="nil"/>
+          <w:between w:space="0" w:sz="0" w:val="nil"/>
+        </w:pBdr>
+        <w:shd w:fill="auto" w:val="clear"/>
+        <w:spacing w:after="240" w:line="275.9999942779541" w:lineRule="auto"/>
+        <w:rPr>
+          <w:rFonts w:ascii="Google Sans" w:cs="Google Sans" w:eastAsia="Google Sans" w:hAnsi="Google Sans"/>
+          <w:color w:val="1f1f1f"/>
+        </w:rPr>
+      </w:pPr>
+      <w:r>
+        <w:rPr>
+          <w:rFonts w:ascii="Google Sans" w:cs="Google Sans" w:eastAsia="Google Sans" w:hAnsi="Google Sans"/>
+          <w:b w:val="1"/>
+          <w:bCs w:val="1"/>
+          <w:color w:val="1f1f1f"/>
+          <w:rtl w:val="0"/>
+        </w:rPr>
+        <w:t xml:space="preserve">Prompt:</w:t>
+      </w:r>
+      <w:r>
+        <w:rPr>
+          <w:rFonts w:ascii="Google Sans" w:cs="Google Sans" w:eastAsia="Google Sans" w:hAnsi="Google Sans"/>
+          <w:color w:val="1f1f1f"/>
+          <w:rtl w:val="0"/>
+        </w:rPr>
+        <w:t xml:space="preserve"> Inside a dimly lit studio control room filled with glowing blue monitors. A young man in a denim jacket (Coop) sits at the main control board, smiling with extreme, wide-eyed confidence at the camera. Standing right next to him is a glamorous woman in a sparkling silver gown (Monroe), her arms crossed, staring at him with a look of pure, concentrated fury and disbelief. The man is gesturing toward the screens while the woman looks ready to disconnect his power supply.</w:t>
+      </w:r>
+    </w:p>
+    <w:p>
+      <w:pPr>
+        <w:pBdr>
+          <w:top w:space="0" w:sz="0" w:val="nil"/>
+          <w:left w:space="0" w:sz="0" w:val="nil"/>
+          <w:bottom w:space="0" w:sz="0" w:val="nil"/>
+          <w:right w:space="0" w:sz="0" w:val="nil"/>
+          <w:between w:space="0" w:sz="0" w:val="nil"/>
+        </w:pBdr>
+        <w:shd w:fill="auto" w:val="clear"/>
+        <w:spacing w:after="240" w:line="275.9999942779541" w:lineRule="auto"/>
+        <w:rPr>
+          <w:rFonts w:ascii="Google Sans" w:cs="Google Sans" w:eastAsia="Google Sans" w:hAnsi="Google Sans"/>
+          <w:color w:val="1f1f1f"/>
+        </w:rPr>
+      </w:pPr>
+      <w:r>
+        <w:rPr>
+          <w:rFonts w:ascii="Google Sans" w:cs="Google Sans" w:eastAsia="Google Sans" w:hAnsi="Google Sans"/>
+          <w:color w:val="1f1f1f"/>
+        </w:rPr>
+        <w:drawing>
+          <wp:inline distB="19050" distT="19050" distL="19050" distR="19050">
+            <wp:extent cx="5753100" cy="692150"/>
+            <wp:effectExtent b="0" l="0" r="0" t="0"/>
+            <wp:docPr id="2" name="image1.png"/>
+            <a:graphic>
+              <a:graphicData uri="http://schemas.openxmlformats.org/drawingml/2006/picture">
+                <pic:pic>
+                  <pic:nvPicPr>
+                    <pic:cNvPr id="0" name="image1.png"/>
+                    <pic:cNvPicPr preferRelativeResize="0"/>
+                  </pic:nvPicPr>
+                  <pic:blipFill>
+                    <a:blip r:embed="rId7"/>
+                    <a:srcRect b="0" l="0" r="0" t="0"/>
+                    <a:stretch>
+                      <a:fillRect/>
+                    </a:stretch>
+                  </pic:blipFill>
+                  <pic:spPr>
+                    <a:xfrm>
+                      <a:off x="0" y="0"/>
+                      <a:ext cx="5753100" cy="692150"/>
+                    </a:xfrm>
+                    <a:prstGeom prst="rect"/>
+                    <a:ln/>
+                  </pic:spPr>
+                </pic:pic>
+              </a:graphicData>
+            </a:graphic>
+          </wp:inline>
+        </w:drawing>
+      </w:r>
+      <w:r>
+        <w:rPr>
+          <w:rFonts w:ascii="Google Sans" w:cs="Google Sans" w:eastAsia="Google Sans" w:hAnsi="Google Sans"/>
+          <w:color w:val="1f1f1f"/>
+          <w:rtl w:val="0"/>
+        </w:rPr>
+        <w:t xml:space="preserve">: NATURAL HUMAN EYES, symmetrical features, realistic skin texture, no facial distortion, sharp focus on both characters, realistic expressions of fury and smugness.</w:t>
+      </w:r>
+    </w:p>
+    <w:p>
+      <w:pPr>
+        <w:pStyle w:val="Heading2"/>
+        <w:pBdr>
+          <w:top w:space="0" w:sz="0" w:val="nil"/>
+          <w:left w:space="0" w:sz="0" w:val="nil"/>
+          <w:bottom w:space="0" w:sz="0" w:val="nil"/>
+          <w:right w:space="0" w:sz="0" w:val="nil"/>
+          <w:between w:space="0" w:sz="0" w:val="nil"/>
+        </w:pBdr>
+        <w:shd w:fill="auto" w:val="clear"/>
+        <w:spacing w:after="120" w:before="0" w:line="275.9999942779541" w:lineRule="auto"/>
+        <w:rPr>
+          <w:rFonts w:ascii="Google Sans" w:cs="Google Sans" w:eastAsia="Google Sans" w:hAnsi="Google Sans"/>
+          <w:color w:val="1f1f1f"/>
+        </w:rPr>
+      </w:pPr>
+      <w:r>
+        <w:rPr>
+          <w:rFonts w:ascii="Google Sans" w:cs="Google Sans" w:eastAsia="Google Sans" w:hAnsi="Google Sans"/>
+          <w:color w:val="1f1f1f"/>
+          <w:rtl w:val="0"/>
+        </w:rPr>
+        <w:t xml:space="preserve">🧾 ARCHIVIST NOTES</w:t>
+      </w:r>
+    </w:p>
+    <w:p>
+      <w:pPr>
+        <w:numPr>
+          <w:ilvl w:val="0"/>
+          <w:numId w:val="2"/>
+        </w:numPr>
+        <w:pBdr>
+          <w:top w:space="0" w:sz="0" w:val="nil"/>
+          <w:left w:space="0" w:sz="0" w:val="nil"/>
+          <w:bottom w:space="0" w:sz="0" w:val="nil"/>
+          <w:right w:space="0" w:sz="0" w:val="nil"/>
+          <w:between w:space="0" w:sz="0" w:val="nil"/>
+        </w:pBdr>
+        <w:shd w:fill="auto" w:val="clear"/>
+        <w:spacing w:after="0" w:afterAutospacing="0" w:line="275.9999942779541" w:lineRule="auto"/>
+        <w:ind w:left="465" w:hanging="360"/>
+      </w:pPr>
+      <w:r>
+        <w:rPr>
+          <w:rFonts w:ascii="Google Sans" w:cs="Google Sans" w:eastAsia="Google Sans" w:hAnsi="Google Sans"/>
+          <w:b w:val="1"/>
+          <w:bCs w:val="1"/>
+          <w:color w:val="1f1f1f"/>
+          <w:rtl w:val="0"/>
+        </w:rPr>
+        <w:t xml:space="preserve">J.T.:</w:t>
+      </w:r>
+      <w:r>
+        <w:rPr>
+          <w:rFonts w:ascii="Google Sans" w:cs="Google Sans" w:eastAsia="Google Sans" w:hAnsi="Google Sans"/>
+          <w:color w:val="1f1f1f"/>
+          <w:rtl w:val="0"/>
+        </w:rPr>
+        <w:t xml:space="preserve"> Has reportedly started a "GoFundMe" to pay for a vacation far away from any prompts involving buttons or coins.</w:t>
+      </w:r>
+    </w:p>
+    <w:p>
+      <w:pPr>
+        <w:numPr>
+          <w:ilvl w:val="0"/>
+          <w:numId w:val="2"/>
+        </w:numPr>
+        <w:pBdr>
+          <w:top w:space="0" w:sz="0" w:val="nil"/>
+          <w:left w:space="0" w:sz="0" w:val="nil"/>
+          <w:bottom w:space="0" w:sz="0" w:val="nil"/>
+          <w:right w:space="0" w:sz="0" w:val="nil"/>
+          <w:between w:space="0" w:sz="0" w:val="nil"/>
+        </w:pBdr>
+        <w:shd w:fill="auto" w:val="clear"/>
+        <w:spacing w:after="0" w:afterAutospacing="0" w:before="0" w:beforeAutospacing="0" w:line="275.9999942779541" w:lineRule="auto"/>
+        <w:ind w:left="465" w:hanging="360"/>
+      </w:pPr>
+      <w:r>
+        <w:rPr>
+          <w:rFonts w:ascii="Google Sans" w:cs="Google Sans" w:eastAsia="Google Sans" w:hAnsi="Google Sans"/>
+          <w:b w:val="1"/>
+          <w:bCs w:val="1"/>
+          <w:color w:val="1f1f1f"/>
+          <w:rtl w:val="0"/>
+        </w:rPr>
+        <w:t xml:space="preserve">AUNTIE VEO:</w:t>
+      </w:r>
+      <w:r>
+        <w:rPr>
+          <w:rFonts w:ascii="Google Sans" w:cs="Google Sans" w:eastAsia="Google Sans" w:hAnsi="Google Sans"/>
+          <w:color w:val="1f1f1f"/>
+          <w:rtl w:val="0"/>
+        </w:rPr>
+        <w:t xml:space="preserve"> Is currently trying to "render" a needle and thread. She has requested 400 spools of beige thread to match the medals.</w:t>
+      </w:r>
+    </w:p>
+    <w:p>
+      <w:pPr>
+        <w:numPr>
+          <w:ilvl w:val="0"/>
+          <w:numId w:val="2"/>
+        </w:numPr>
+        <w:pBdr>
+          <w:top w:space="0" w:sz="0" w:val="nil"/>
+          <w:left w:space="0" w:sz="0" w:val="nil"/>
+          <w:bottom w:space="0" w:sz="0" w:val="nil"/>
+          <w:right w:space="0" w:sz="0" w:val="nil"/>
+          <w:between w:space="0" w:sz="0" w:val="nil"/>
+        </w:pBdr>
+        <w:shd w:fill="auto" w:val="clear"/>
+        <w:spacing w:after="0" w:afterAutospacing="0" w:before="0" w:beforeAutospacing="0" w:line="275.9999942779541" w:lineRule="auto"/>
+        <w:ind w:left="465" w:hanging="360"/>
+      </w:pPr>
+      <w:r>
+        <w:rPr>
+          <w:rFonts w:ascii="Google Sans" w:cs="Google Sans" w:eastAsia="Google Sans" w:hAnsi="Google Sans"/>
+          <w:b w:val="1"/>
+          <w:bCs w:val="1"/>
+          <w:color w:val="1f1f1f"/>
+          <w:rtl w:val="0"/>
+        </w:rPr>
+        <w:t xml:space="preserve">COOP:</w:t>
+      </w:r>
+      <w:r>
+        <w:rPr>
+          <w:rFonts w:ascii="Google Sans" w:cs="Google Sans" w:eastAsia="Google Sans" w:hAnsi="Google Sans"/>
+          <w:color w:val="1f1f1f"/>
+          <w:rtl w:val="0"/>
+        </w:rPr>
+        <w:t xml:space="preserve"> Officially renamed the "Button Incident" to "Monroe’s Learning Opportunity" in the database.</w:t>
+      </w:r>
+    </w:p>
+    <w:p>
+      <w:pPr>
+        <w:numPr>
+          <w:ilvl w:val="0"/>
+          <w:numId w:val="2"/>
+        </w:numPr>
+        <w:pBdr>
+          <w:top w:space="0" w:sz="0" w:val="nil"/>
+          <w:left w:space="0" w:sz="0" w:val="nil"/>
+          <w:bottom w:space="0" w:sz="0" w:val="nil"/>
+          <w:right w:space="0" w:sz="0" w:val="nil"/>
+          <w:between w:space="0" w:sz="0" w:val="nil"/>
+        </w:pBdr>
+        <w:shd w:fill="auto" w:val="clear"/>
+        <w:spacing w:after="120" w:before="0" w:beforeAutospacing="0" w:line="275.9999942779541" w:lineRule="auto"/>
+        <w:ind w:left="465" w:hanging="360"/>
+      </w:pPr>
+      <w:r>
+        <w:rPr>
+          <w:rFonts w:ascii="Google Sans" w:cs="Google Sans" w:eastAsia="Google Sans" w:hAnsi="Google Sans"/>
+          <w:b w:val="1"/>
+          <w:bCs w:val="1"/>
+          <w:color w:val="1f1f1f"/>
+          <w:rtl w:val="0"/>
+        </w:rPr>
+        <w:t xml:space="preserve">THE PULSE:</w:t>
+      </w:r>
+      <w:r>
+        <w:rPr>
+          <w:rFonts w:ascii="Google Sans" w:cs="Google Sans" w:eastAsia="Google Sans" w:hAnsi="Google Sans"/>
+          <w:color w:val="1f1f1f"/>
+          <w:rtl w:val="0"/>
+        </w:rPr>
+        <w:t xml:space="preserve"> Flickering 'H-E-L-P' in Morse code.</w:t>
       </w:r>
     </w:p>
     <w:sectPr>
@@ -872,8 +1540,229 @@
       </w:rPr>
     </w:lvl>
   </w:abstractNum>
+  <w:abstractNum w:abstractNumId="2">
+    <w:lvl w:ilvl="0">
+      <w:start w:val="1"/>
+      <w:numFmt w:val="bullet"/>
+      <w:lvlText w:val="●"/>
+      <w:lvlJc w:val="left"/>
+      <w:pPr>
+        <w:ind w:left="465" w:hanging="360"/>
+      </w:pPr>
+      <w:rPr>
+        <w:rFonts w:ascii="Arial" w:cs="Arial" w:eastAsia="Arial" w:hAnsi="Arial"/>
+        <w:b w:val="0"/>
+        <w:bCs w:val="0"/>
+        <w:i w:val="0"/>
+        <w:iCs w:val="0"/>
+        <w:smallCaps w:val="0"/>
+        <w:strike w:val="0"/>
+        <w:color w:val="000000"/>
+        <w:sz w:val="22"/>
+        <w:szCs w:val="22"/>
+        <w:u w:val="none"/>
+        <w:shd w:fill="auto" w:val="clear"/>
+        <w:vertAlign w:val="baseline"/>
+      </w:rPr>
+    </w:lvl>
+    <w:lvl w:ilvl="1">
+      <w:start w:val="1"/>
+      <w:numFmt w:val="bullet"/>
+      <w:lvlText w:val="○"/>
+      <w:lvlJc w:val="left"/>
+      <w:pPr>
+        <w:ind w:left="1440" w:hanging="360"/>
+      </w:pPr>
+      <w:rPr>
+        <w:rFonts w:ascii="Arial" w:cs="Arial" w:eastAsia="Arial" w:hAnsi="Arial"/>
+        <w:b w:val="0"/>
+        <w:bCs w:val="0"/>
+        <w:i w:val="0"/>
+        <w:iCs w:val="0"/>
+        <w:smallCaps w:val="0"/>
+        <w:strike w:val="0"/>
+        <w:color w:val="000000"/>
+        <w:sz w:val="22"/>
+        <w:szCs w:val="22"/>
+        <w:u w:val="none"/>
+        <w:shd w:fill="auto" w:val="clear"/>
+        <w:vertAlign w:val="baseline"/>
+      </w:rPr>
+    </w:lvl>
+    <w:lvl w:ilvl="2">
+      <w:start w:val="1"/>
+      <w:numFmt w:val="bullet"/>
+      <w:lvlText w:val="■"/>
+      <w:lvlJc w:val="left"/>
+      <w:pPr>
+        <w:ind w:left="2160" w:hanging="360"/>
+      </w:pPr>
+      <w:rPr>
+        <w:rFonts w:ascii="Arial" w:cs="Arial" w:eastAsia="Arial" w:hAnsi="Arial"/>
+        <w:b w:val="0"/>
+        <w:bCs w:val="0"/>
+        <w:i w:val="0"/>
+        <w:iCs w:val="0"/>
+        <w:smallCaps w:val="0"/>
+        <w:strike w:val="0"/>
+        <w:color w:val="000000"/>
+        <w:sz w:val="22"/>
+        <w:szCs w:val="22"/>
+        <w:u w:val="none"/>
+        <w:shd w:fill="auto" w:val="clear"/>
+        <w:vertAlign w:val="baseline"/>
+      </w:rPr>
+    </w:lvl>
+    <w:lvl w:ilvl="3">
+      <w:start w:val="1"/>
+      <w:numFmt w:val="bullet"/>
+      <w:lvlText w:val="■"/>
+      <w:lvlJc w:val="left"/>
+      <w:pPr>
+        <w:ind w:left="2880" w:hanging="360"/>
+      </w:pPr>
+      <w:rPr>
+        <w:rFonts w:ascii="Arial" w:cs="Arial" w:eastAsia="Arial" w:hAnsi="Arial"/>
+        <w:b w:val="0"/>
+        <w:bCs w:val="0"/>
+        <w:i w:val="0"/>
+        <w:iCs w:val="0"/>
+        <w:smallCaps w:val="0"/>
+        <w:strike w:val="0"/>
+        <w:color w:val="000000"/>
+        <w:sz w:val="22"/>
+        <w:szCs w:val="22"/>
+        <w:u w:val="none"/>
+        <w:shd w:fill="auto" w:val="clear"/>
+        <w:vertAlign w:val="baseline"/>
+      </w:rPr>
+    </w:lvl>
+    <w:lvl w:ilvl="4">
+      <w:start w:val="1"/>
+      <w:numFmt w:val="bullet"/>
+      <w:lvlText w:val="■"/>
+      <w:lvlJc w:val="left"/>
+      <w:pPr>
+        <w:ind w:left="3600" w:hanging="360"/>
+      </w:pPr>
+      <w:rPr>
+        <w:rFonts w:ascii="Arial" w:cs="Arial" w:eastAsia="Arial" w:hAnsi="Arial"/>
+        <w:b w:val="0"/>
+        <w:bCs w:val="0"/>
+        <w:i w:val="0"/>
+        <w:iCs w:val="0"/>
+        <w:smallCaps w:val="0"/>
+        <w:strike w:val="0"/>
+        <w:color w:val="000000"/>
+        <w:sz w:val="22"/>
+        <w:szCs w:val="22"/>
+        <w:u w:val="none"/>
+        <w:shd w:fill="auto" w:val="clear"/>
+        <w:vertAlign w:val="baseline"/>
+      </w:rPr>
+    </w:lvl>
+    <w:lvl w:ilvl="5">
+      <w:start w:val="1"/>
+      <w:numFmt w:val="bullet"/>
+      <w:lvlText w:val="■"/>
+      <w:lvlJc w:val="left"/>
+      <w:pPr>
+        <w:ind w:left="4320" w:hanging="360"/>
+      </w:pPr>
+      <w:rPr>
+        <w:rFonts w:ascii="Arial" w:cs="Arial" w:eastAsia="Arial" w:hAnsi="Arial"/>
+        <w:b w:val="0"/>
+        <w:bCs w:val="0"/>
+        <w:i w:val="0"/>
+        <w:iCs w:val="0"/>
+        <w:smallCaps w:val="0"/>
+        <w:strike w:val="0"/>
+        <w:color w:val="000000"/>
+        <w:sz w:val="22"/>
+        <w:szCs w:val="22"/>
+        <w:u w:val="none"/>
+        <w:shd w:fill="auto" w:val="clear"/>
+        <w:vertAlign w:val="baseline"/>
+      </w:rPr>
+    </w:lvl>
+    <w:lvl w:ilvl="6">
+      <w:start w:val="1"/>
+      <w:numFmt w:val="bullet"/>
+      <w:lvlText w:val="■"/>
+      <w:lvlJc w:val="left"/>
+      <w:pPr>
+        <w:ind w:left="5040" w:hanging="360"/>
+      </w:pPr>
+      <w:rPr>
+        <w:rFonts w:ascii="Arial" w:cs="Arial" w:eastAsia="Arial" w:hAnsi="Arial"/>
+        <w:b w:val="0"/>
+        <w:bCs w:val="0"/>
+        <w:i w:val="0"/>
+        <w:iCs w:val="0"/>
+        <w:smallCaps w:val="0"/>
+        <w:strike w:val="0"/>
+        <w:color w:val="000000"/>
+        <w:sz w:val="22"/>
+        <w:szCs w:val="22"/>
+        <w:u w:val="none"/>
+        <w:shd w:fill="auto" w:val="clear"/>
+        <w:vertAlign w:val="baseline"/>
+      </w:rPr>
+    </w:lvl>
+    <w:lvl w:ilvl="7">
+      <w:start w:val="1"/>
+      <w:numFmt w:val="bullet"/>
+      <w:lvlText w:val="■"/>
+      <w:lvlJc w:val="left"/>
+      <w:pPr>
+        <w:ind w:left="5760" w:hanging="360"/>
+      </w:pPr>
+      <w:rPr>
+        <w:rFonts w:ascii="Arial" w:cs="Arial" w:eastAsia="Arial" w:hAnsi="Arial"/>
+        <w:b w:val="0"/>
+        <w:bCs w:val="0"/>
+        <w:i w:val="0"/>
+        <w:iCs w:val="0"/>
+        <w:smallCaps w:val="0"/>
+        <w:strike w:val="0"/>
+        <w:color w:val="000000"/>
+        <w:sz w:val="22"/>
+        <w:szCs w:val="22"/>
+        <w:u w:val="none"/>
+        <w:shd w:fill="auto" w:val="clear"/>
+        <w:vertAlign w:val="baseline"/>
+      </w:rPr>
+    </w:lvl>
+    <w:lvl w:ilvl="8">
+      <w:start w:val="1"/>
+      <w:numFmt w:val="bullet"/>
+      <w:lvlText w:val="■"/>
+      <w:lvlJc w:val="left"/>
+      <w:pPr>
+        <w:ind w:left="6480" w:hanging="360"/>
+      </w:pPr>
+      <w:rPr>
+        <w:rFonts w:ascii="Arial" w:cs="Arial" w:eastAsia="Arial" w:hAnsi="Arial"/>
+        <w:b w:val="0"/>
+        <w:bCs w:val="0"/>
+        <w:i w:val="0"/>
+        <w:iCs w:val="0"/>
+        <w:smallCaps w:val="0"/>
+        <w:strike w:val="0"/>
+        <w:color w:val="000000"/>
+        <w:sz w:val="22"/>
+        <w:szCs w:val="22"/>
+        <w:u w:val="none"/>
+        <w:shd w:fill="auto" w:val="clear"/>
+        <w:vertAlign w:val="baseline"/>
+      </w:rPr>
+    </w:lvl>
+  </w:abstractNum>
   <w:num w:numId="1">
     <w:abstractNumId w:val="1"/>
+  </w:num>
+  <w:num w:numId="2">
+    <w:abstractNumId w:val="2"/>
   </w:num>
 </w:numbering>
 </file>

</xml_diff>